<commit_message>
Implement phase 2 compliance and refund workflows
</commit_message>
<xml_diff>
--- a/plan/OPTPal-Roadmap-v2-Updated.docx
+++ b/plan/OPTPal-Roadmap-v2-Updated.docx
@@ -1509,13 +1509,7 @@
         <w:spacing w:after="140" w:line="276"/>
       </w:pPr>
       <w:r>
-        <w:rPr>
-          <w:rFonts w:ascii="Arial" w:cs="Arial" w:eastAsia="Arial" w:hAnsi="Arial"/>
-          <w:color w:val="333333"/>
-          <w:sz w:val="21"/>
-          <w:szCs w:val="21"/>
-        </w:rPr>
-        <w:t xml:space="preserve">These features build on what already exists in the codebase and deliver the core value proposition.</w:t>
+        <w:t>These features build on what already exists in the codebase and deliver the core value proposition. Status update (March 10, 2026): Features 1, 2, 3, 4, 5, 6, and 7 are completed. Phase 1 is complete, and Phase 2 is underway. The next best implementation target is Feature 8, Policy Alert Feed.</w:t>
       </w:r>
     </w:p>
     <w:p>
@@ -1539,6 +1533,7 @@
         <w:gridCol w:w="500"/>
         <w:gridCol w:w="3200"/>
         <w:gridCol w:w="5660"/>
+        <w:gridCol w:w="5660"/>
       </w:tblGrid>
       <w:tr>
         <w:tc>
@@ -1634,6 +1629,22 @@
             </w:r>
           </w:p>
         </w:tc>
+        <w:tc>
+          <w:tcPr>
+            <w:tcW w:type="dxa" w:w="5660"/>
+          </w:tcPr>
+          <w:p>
+            <w:pPr>
+              <w:jc w:val="center"/>
+            </w:pPr>
+            <w:r>
+              <w:rPr>
+                <w:b/>
+              </w:rPr>
+              <w:t>Status</w:t>
+            </w:r>
+          </w:p>
+        </w:tc>
       </w:tr>
       <w:tr>
         <w:tc>
@@ -1726,6 +1737,22 @@
             </w:r>
           </w:p>
         </w:tc>
+        <w:tc>
+          <w:tcPr>
+            <w:tcW w:type="dxa" w:w="5660"/>
+          </w:tcPr>
+          <w:p>
+            <w:pPr>
+              <w:jc w:val="center"/>
+            </w:pPr>
+            <w:r>
+              <w:rPr>
+                <w:b/>
+              </w:rPr>
+              <w:t>Completed</w:t>
+            </w:r>
+          </w:p>
+        </w:tc>
       </w:tr>
       <w:tr>
         <w:tc>
@@ -1818,6 +1845,16 @@
             </w:r>
           </w:p>
         </w:tc>
+        <w:tc>
+          <w:tcPr>
+            <w:tcW w:type="dxa" w:w="5660"/>
+          </w:tcPr>
+          <w:p>
+            <w:r>
+              <w:t>Completed</w:t>
+            </w:r>
+          </w:p>
+        </w:tc>
       </w:tr>
       <w:tr>
         <w:tc>
@@ -1910,6 +1947,16 @@
             </w:r>
           </w:p>
         </w:tc>
+        <w:tc>
+          <w:tcPr>
+            <w:tcW w:type="dxa" w:w="5660"/>
+          </w:tcPr>
+          <w:p>
+            <w:r>
+              <w:t>Completed</w:t>
+            </w:r>
+          </w:p>
+        </w:tc>
       </w:tr>
       <w:tr>
         <w:tc>
@@ -2002,6 +2049,16 @@
             </w:r>
           </w:p>
         </w:tc>
+        <w:tc>
+          <w:tcPr>
+            <w:tcW w:type="dxa" w:w="5660"/>
+          </w:tcPr>
+          <w:p>
+            <w:r>
+              <w:t>Completed</w:t>
+            </w:r>
+          </w:p>
+        </w:tc>
       </w:tr>
       <w:tr>
         <w:tc>
@@ -2091,6 +2148,22 @@
                 <w:szCs w:val="18"/>
               </w:rPr>
               <w:t xml:space="preserve">Biometric lock, Keystore encryption for local cache, client-side encryption before cloud upload, processing consent dialogs.</w:t>
+            </w:r>
+          </w:p>
+        </w:tc>
+        <w:tc>
+          <w:tcPr>
+            <w:tcW w:type="dxa" w:w="5660"/>
+          </w:tcPr>
+          <w:p>
+            <w:pPr>
+              <w:jc w:val="center"/>
+            </w:pPr>
+            <w:r>
+              <w:rPr>
+                <w:b/>
+              </w:rPr>
+              <w:t>Completed</w:t>
             </w:r>
           </w:p>
         </w:tc>
@@ -2139,6 +2212,7 @@
         <w:gridCol w:w="500"/>
         <w:gridCol w:w="3200"/>
         <w:gridCol w:w="5660"/>
+        <w:gridCol w:w="5660"/>
       </w:tblGrid>
       <w:tr>
         <w:tc>
@@ -2234,6 +2308,22 @@
             </w:r>
           </w:p>
         </w:tc>
+        <w:tc>
+          <w:tcPr>
+            <w:tcW w:type="dxa" w:w="5660"/>
+          </w:tcPr>
+          <w:p>
+            <w:pPr>
+              <w:jc w:val="center"/>
+            </w:pPr>
+            <w:r>
+              <w:rPr>
+                <w:b/>
+              </w:rPr>
+              <w:t>Status</w:t>
+            </w:r>
+          </w:p>
+        </w:tc>
       </w:tr>
       <w:tr>
         <w:tc>
@@ -2326,6 +2416,16 @@
             </w:r>
           </w:p>
         </w:tc>
+        <w:tc>
+          <w:tcPr>
+            <w:tcW w:type="dxa" w:w="5660"/>
+          </w:tcPr>
+          <w:p>
+            <w:r>
+              <w:t>Completed</w:t>
+            </w:r>
+          </w:p>
+        </w:tc>
       </w:tr>
       <w:tr>
         <w:tc>
@@ -2418,6 +2518,16 @@
             </w:r>
           </w:p>
         </w:tc>
+        <w:tc>
+          <w:tcPr>
+            <w:tcW w:type="dxa" w:w="5660"/>
+          </w:tcPr>
+          <w:p>
+            <w:r>
+              <w:t>Completed</w:t>
+            </w:r>
+          </w:p>
+        </w:tc>
       </w:tr>
       <w:tr>
         <w:tc>
@@ -2510,6 +2620,22 @@
             </w:r>
           </w:p>
         </w:tc>
+        <w:tc>
+          <w:tcPr>
+            <w:tcW w:type="dxa" w:w="5660"/>
+          </w:tcPr>
+          <w:p>
+            <w:pPr>
+              <w:jc w:val="center"/>
+            </w:pPr>
+            <w:r>
+              <w:rPr>
+                <w:b w:val="0"/>
+              </w:rPr>
+              <w:t>Not started</w:t>
+            </w:r>
+          </w:p>
+        </w:tc>
       </w:tr>
       <w:tr>
         <w:tc>
@@ -2599,6 +2725,22 @@
                 <w:szCs w:val="18"/>
               </w:rPr>
               <w:t xml:space="preserve">Single 0–100 score on dashboard. Weighted factors: unemployment days, document expirations, reporting status, USCIS case progress. The daily engagement hook.</w:t>
+            </w:r>
+          </w:p>
+        </w:tc>
+        <w:tc>
+          <w:tcPr>
+            <w:tcW w:type="dxa" w:w="5660"/>
+          </w:tcPr>
+          <w:p>
+            <w:pPr>
+              <w:jc w:val="center"/>
+            </w:pPr>
+            <w:r>
+              <w:rPr>
+                <w:b w:val="0"/>
+              </w:rPr>
+              <w:t>Not started</w:t>
             </w:r>
           </w:p>
         </w:tc>

</xml_diff>

<commit_message>
Implement policy alerts and compliance health score
</commit_message>
<xml_diff>
--- a/plan/OPTPal-Roadmap-v2-Updated.docx
+++ b/plan/OPTPal-Roadmap-v2-Updated.docx
@@ -1509,7 +1509,7 @@
         <w:spacing w:after="140" w:line="276"/>
       </w:pPr>
       <w:r>
-        <w:t>These features build on what already exists in the codebase and deliver the core value proposition. Status update (March 10, 2026): Features 1, 2, 3, 4, 5, 6, and 7 are completed. Phase 1 is complete, and Phase 2 is underway. The next best implementation target is Feature 8, Policy Alert Feed.</w:t>
+        <w:t>These features build on what already exists in the codebase and deliver the core value proposition. Status update (March 10, 2026): Features 1, 2, 3, 4, 5, 6, 7, 8, and 9 are completed. The revised 9-feature MVP is complete. The next best implementation target is the first post-launch feature, I-983 AI Assistant.</w:t>
       </w:r>
     </w:p>
     <w:p>
@@ -2625,14 +2625,8 @@
             <w:tcW w:type="dxa" w:w="5660"/>
           </w:tcPr>
           <w:p>
-            <w:pPr>
-              <w:jc w:val="center"/>
-            </w:pPr>
-            <w:r>
-              <w:rPr>
-                <w:b w:val="0"/>
-              </w:rPr>
-              <w:t>Not started</w:t>
+            <w:r>
+              <w:t>Completed</w:t>
             </w:r>
           </w:p>
         </w:tc>
@@ -2733,14 +2727,8 @@
             <w:tcW w:type="dxa" w:w="5660"/>
           </w:tcPr>
           <w:p>
-            <w:pPr>
-              <w:jc w:val="center"/>
-            </w:pPr>
-            <w:r>
-              <w:rPr>
-                <w:b w:val="0"/>
-              </w:rPr>
-              <w:t>Not started</w:t>
+            <w:r>
+              <w:t>Completed</w:t>
             </w:r>
           </w:p>
         </w:tc>

</xml_diff>

<commit_message>
Implement H-1B, I-983, pathway planner, and scenario simulator
</commit_message>
<xml_diff>
--- a/plan/OPTPal-Roadmap-v2-Updated.docx
+++ b/plan/OPTPal-Roadmap-v2-Updated.docx
@@ -1509,7 +1509,7 @@
         <w:spacing w:after="140" w:line="276"/>
       </w:pPr>
       <w:r>
-        <w:t>These features build on what already exists in the codebase and deliver the core value proposition. Status update (March 10, 2026): Features 1, 2, 3, 4, 5, 6, 7, 8, and 9 are completed. The revised 9-feature MVP is complete. The next best implementation target is the first post-launch feature, I-983 AI Assistant.</w:t>
+        <w:t>These features build on what already exists in the codebase and deliver the core value proposition. Status update (March 11, 2026): Features 1, 2, 3, 4, 5, 6, 7, 8, and 9 are completed. The revised 9-feature MVP is complete. The first three post-launch features, I-983 AI Assistant, Visa Pathway Planner, and H-1B Dashboard, are now implemented. The H-1B Dashboard ships readiness scoring, employer verification, cap-season timeline, I-129 tracking, cap-gap continuity, evidence checklists, and policy cards with changelog metadata. The next best implementation target is Scenario Simulator.</w:t>
       </w:r>
     </w:p>
     <w:p>
@@ -2744,24 +2744,7 @@
         <w:spacing w:after="140" w:line="276"/>
       </w:pPr>
       <w:r>
-        <w:rPr>
-          <w:rFonts w:ascii="Arial" w:cs="Arial" w:eastAsia="Arial" w:hAnsi="Arial"/>
-          <w:b/>
-          <w:bCs/>
-          <w:color w:val="333333"/>
-          <w:sz w:val="21"/>
-          <w:szCs w:val="21"/>
-        </w:rPr>
-        <w:t xml:space="preserve">Everything else from the original 28 features moves to post-launch. </w:t>
-      </w:r>
-      <w:r>
-        <w:rPr>
-          <w:rFonts w:ascii="Arial" w:cs="Arial" w:eastAsia="Arial" w:hAnsi="Arial"/>
-          <w:color w:val="333333"/>
-          <w:sz w:val="21"/>
-          <w:szCs w:val="21"/>
-        </w:rPr>
-        <w:t xml:space="preserve">I-983 AI Assistant, Visa Pathway Planner, H-1B Dashboard, Scenario Simulator, Peer Data, DSO Directory, Multi-Language, and Widget all ship in v1.1–v1.3 based on user demand signals.</w:t>
+        <w:t>Everything else from the original 28 features moves to post-launch. I-983 AI Assistant, Visa Pathway Planner, and H-1B Dashboard are now completed. The next post-launch priorities are Scenario Simulator, Peer Data, DSO Directory, Multi-Language, and Widget for v1.1-v1.3 based on user demand signals.</w:t>
       </w:r>
     </w:p>
     <w:p>

</xml_diff>